<commit_message>
Refresh Jun–Oct resume materials and prune obsolete career files.
Capture Load Healer, Martech cutover, CoEs, and Jiadroid progress on resumes and the career site index; drop stale May hot-jobs list, backup docx, and Figure apply debug artifacts.

Co-authored-by: Cursor <cursoragent@cursor.com>
</commit_message>
<xml_diff>
--- a/Mingresume-release-platform.docx
+++ b/Mingresume-release-platform.docx
@@ -136,33 +136,72 @@
         <w:rPr>
           <w:sz w:val="21"/>
         </w:rPr>
-        <w:t xml:space="preserve"> — the package-registry control plane every one of GEICO's 3000+ engineers depends on — where I drove Artifactory from </w:t>
-      </w:r>
-      <w:r>
-        <w:rPr>
-          <w:b/>
-          <w:sz w:val="21"/>
-        </w:rPr>
-        <w:t>~1 major incident/month to four-nines (99.99%) availability SLO</w:t>
-      </w:r>
-      <w:r>
-        <w:rPr>
-          <w:sz w:val="21"/>
-        </w:rPr>
-        <w:t xml:space="preserve">, architected the </w:t>
-      </w:r>
-      <w:r>
-        <w:rPr>
-          <w:b/>
-          <w:sz w:val="21"/>
-        </w:rPr>
-        <w:t>Entra ID auth boundary for `amp-control-plane`</w:t>
-      </w:r>
-      <w:r>
-        <w:rPr>
-          <w:sz w:val="21"/>
-        </w:rPr>
-        <w:t xml:space="preserve"> (Go JWT middleware + APIM defense-in-depth), and am </w:t>
+        <w:t xml:space="preserve"> — the package-registry control plane every one of GEICO's 3000+ engineers depends on — where I drove Artifactory to </w:t>
+      </w:r>
+      <w:r>
+        <w:rPr>
+          <w:b/>
+          <w:sz w:val="21"/>
+        </w:rPr>
+        <w:t>four-nines (99.99%) availability</w:t>
+      </w:r>
+      <w:r>
+        <w:rPr>
+          <w:sz w:val="21"/>
+        </w:rPr>
+        <w:t xml:space="preserve">, shipped </w:t>
+      </w:r>
+      <w:r>
+        <w:rPr>
+          <w:b/>
+          <w:sz w:val="21"/>
+        </w:rPr>
+        <w:t>Load Healer Reactive</w:t>
+      </w:r>
+      <w:r>
+        <w:rPr>
+          <w:sz w:val="21"/>
+        </w:rPr>
+        <w:t xml:space="preserve"> (OUTAGE → HTTP 429 on NP/PD2), upgraded to </w:t>
+      </w:r>
+      <w:r>
+        <w:rPr>
+          <w:b/>
+          <w:sz w:val="21"/>
+        </w:rPr>
+        <w:t>Artifactory 7.161.15</w:t>
+      </w:r>
+      <w:r>
+        <w:rPr>
+          <w:sz w:val="21"/>
+        </w:rPr>
+        <w:t xml:space="preserve">, and am driving </w:t>
+      </w:r>
+      <w:r>
+        <w:rPr>
+          <w:b/>
+          <w:sz w:val="21"/>
+        </w:rPr>
+        <w:t>Martech → JFrog SaaS cutover</w:t>
+      </w:r>
+      <w:r>
+        <w:rPr>
+          <w:sz w:val="21"/>
+        </w:rPr>
+        <w:t xml:space="preserve"> (Jan 30 hard date) across MAP, CDP, Billing, and Payments with </w:t>
+      </w:r>
+      <w:r>
+        <w:rPr>
+          <w:b/>
+          <w:sz w:val="21"/>
+        </w:rPr>
+        <w:t>`amp-migrate`</w:t>
+      </w:r>
+      <w:r>
+        <w:rPr>
+          <w:sz w:val="21"/>
+        </w:rPr>
+        <w:t xml:space="preserve"> for OIDC/repo-settings. Earlier: </w:t>
       </w:r>
       <w:r>
         <w:rPr>
@@ -175,7 +214,20 @@
         <w:rPr>
           <w:sz w:val="21"/>
         </w:rPr>
-        <w:t xml:space="preserve"> (GitHub Actions workflows validating all 11 supported package types end-to-end; load test at 5,000 repos / 5,000 parallel artifacts). Previously </w:t>
+        <w:t xml:space="preserve"> (11 package types e2e; 5,000×5,000 load test) and </w:t>
+      </w:r>
+      <w:r>
+        <w:rPr>
+          <w:b/>
+          <w:sz w:val="21"/>
+        </w:rPr>
+        <w:t>Entra ID auth for `amp-control-plane`</w:t>
+      </w:r>
+      <w:r>
+        <w:rPr>
+          <w:sz w:val="21"/>
+        </w:rPr>
+        <w:t xml:space="preserve"> on ACS. Previously </w:t>
       </w:r>
       <w:r>
         <w:rPr>
@@ -188,20 +240,20 @@
         <w:rPr>
           <w:sz w:val="21"/>
         </w:rPr>
-        <w:t xml:space="preserve">: led HA Jenkins + HA Nexus migrations for a ~500-engineer org deploying to thousands of production servers, </w:t>
-      </w:r>
-      <w:r>
-        <w:rPr>
-          <w:b/>
-          <w:sz w:val="21"/>
-        </w:rPr>
-        <w:t>saving $600K+/yr in enterprise license costs</w:t>
-      </w:r>
-      <w:r>
-        <w:rPr>
-          <w:sz w:val="21"/>
-        </w:rPr>
-        <w:t xml:space="preserve">. </w:t>
+        <w:t xml:space="preserve"> (Jenkins+Nexus HA, </w:t>
+      </w:r>
+      <w:r>
+        <w:rPr>
+          <w:b/>
+          <w:sz w:val="21"/>
+        </w:rPr>
+        <w:t>$600K+/yr</w:t>
+      </w:r>
+      <w:r>
+        <w:rPr>
+          <w:sz w:val="21"/>
+        </w:rPr>
+        <w:t xml:space="preserve"> savings) and </w:t>
       </w:r>
       <w:r>
         <w:rPr>
@@ -214,7 +266,7 @@
         <w:rPr>
           <w:sz w:val="21"/>
         </w:rPr>
-        <w:t xml:space="preserve"> through SOC 2 Type II remediation and IPO readiness (HashiCorp Vault + SonarCloud across CI/CD). Comfortable across the full DevOps stack: </w:t>
+        <w:t xml:space="preserve"> (SOC 2 Type II / IPO). Stack: </w:t>
       </w:r>
       <w:r>
         <w:rPr>
@@ -227,7 +279,7 @@
         <w:rPr>
           <w:sz w:val="21"/>
         </w:rPr>
-        <w:t xml:space="preserve">, Python, TypeScript, Shell; </w:t>
+        <w:t xml:space="preserve">, Python, TypeScript; </w:t>
       </w:r>
       <w:r>
         <w:rPr>
@@ -240,33 +292,7 @@
         <w:rPr>
           <w:sz w:val="21"/>
         </w:rPr>
-        <w:t xml:space="preserve">, ArgoCD, </w:t>
-      </w:r>
-      <w:r>
-        <w:rPr>
-          <w:b/>
-          <w:sz w:val="21"/>
-        </w:rPr>
-        <w:t>Azure DevOps Pipelines and GitHub Actions</w:t>
-      </w:r>
-      <w:r>
-        <w:rPr>
-          <w:sz w:val="21"/>
-        </w:rPr>
-        <w:t xml:space="preserve">; deep packet-level network debugging (Azure Firewall TLS DPI RCA, JFrog Go-module cache RCAs). MS in AI at Purdue (in progress) and shipping an </w:t>
-      </w:r>
-      <w:r>
-        <w:rPr>
-          <w:b/>
-          <w:sz w:val="21"/>
-        </w:rPr>
-        <w:t>AI-powered CI/CD migration engine</w:t>
-      </w:r>
-      <w:r>
-        <w:rPr>
-          <w:sz w:val="21"/>
-        </w:rPr>
-        <w:t xml:space="preserve"> for GEICO's JFrog SaaS cutover so the Release Platform itself benefits from agentic automation. U.S. Citizen.</w:t>
+        <w:t>, ArgoCD, ADO + GitHub Actions. MS AI @ Purdue (in progress). U.S. Citizen.</w:t>
       </w:r>
     </w:p>
     <w:p>
@@ -347,39 +373,59 @@
           <w:b/>
           <w:sz w:val="21"/>
         </w:rPr>
-        <w:t>Artifactory reliability turnaround</w:t>
-      </w:r>
-      <w:r>
-        <w:rPr>
-          <w:sz w:val="21"/>
-        </w:rPr>
-        <w:t xml:space="preserve"> — drove the package registry from </w:t>
-      </w:r>
-      <w:r>
-        <w:rPr>
-          <w:b/>
-          <w:sz w:val="21"/>
-        </w:rPr>
-        <w:t>~1 major incident/month to a four-nines (99.99%) availability SLO</w:t>
-      </w:r>
-      <w:r>
-        <w:rPr>
-          <w:sz w:val="21"/>
-        </w:rPr>
-        <w:t xml:space="preserve">; AMP on-call lead, CoE author for </w:t>
-      </w:r>
-      <w:r>
-        <w:rPr>
-          <w:b/>
-          <w:sz w:val="21"/>
-        </w:rPr>
-        <w:t>NOCIM-11695</w:t>
-      </w:r>
-      <w:r>
-        <w:rPr>
-          <w:sz w:val="21"/>
-        </w:rPr>
-        <w:t xml:space="preserve"> (April 2026 Entra-ID-driven Artifactory outage)</w:t>
+        <w:t>Artifactory reliability</w:t>
+      </w:r>
+      <w:r>
+        <w:rPr>
+          <w:sz w:val="21"/>
+        </w:rPr>
+        <w:t xml:space="preserve"> — </w:t>
+      </w:r>
+      <w:r>
+        <w:rPr>
+          <w:b/>
+          <w:sz w:val="21"/>
+        </w:rPr>
+        <w:t>~1 major incident/month → 99.99% SLO</w:t>
+      </w:r>
+      <w:r>
+        <w:rPr>
+          <w:sz w:val="21"/>
+        </w:rPr>
+        <w:t xml:space="preserve">; upgraded to </w:t>
+      </w:r>
+      <w:r>
+        <w:rPr>
+          <w:b/>
+          <w:sz w:val="21"/>
+        </w:rPr>
+        <w:t>7.161.15</w:t>
+      </w:r>
+      <w:r>
+        <w:rPr>
+          <w:sz w:val="21"/>
+        </w:rPr>
+        <w:t xml:space="preserve">; AMP on-call lead; CoE author for NOCIM-11695, NOCIM-12455, </w:t>
+      </w:r>
+      <w:r>
+        <w:rPr>
+          <w:b/>
+          <w:sz w:val="21"/>
+        </w:rPr>
+        <w:t>NOCIM-13154</w:t>
+      </w:r>
+      <w:r>
+        <w:rPr>
+          <w:sz w:val="21"/>
+        </w:rPr>
+        <w:t xml:space="preserve">, </w:t>
+      </w:r>
+      <w:r>
+        <w:rPr>
+          <w:b/>
+          <w:sz w:val="21"/>
+        </w:rPr>
+        <w:t>NOCIM-13213</w:t>
       </w:r>
     </w:p>
     <w:p>
@@ -392,65 +438,39 @@
           <w:b/>
           <w:sz w:val="21"/>
         </w:rPr>
-        <w:t>Technical lead, JFrog SaaS POC</w:t>
-      </w:r>
-      <w:r>
-        <w:rPr>
-          <w:sz w:val="21"/>
-        </w:rPr>
-        <w:t xml:space="preserve"> — three </w:t>
-      </w:r>
-      <w:r>
-        <w:rPr>
-          <w:b/>
-          <w:sz w:val="21"/>
-        </w:rPr>
-        <w:t>GitHub Actions</w:t>
-      </w:r>
-      <w:r>
-        <w:rPr>
-          <w:sz w:val="21"/>
-        </w:rPr>
-        <w:t xml:space="preserve"> workflows validating </w:t>
-      </w:r>
-      <w:r>
-        <w:rPr>
-          <w:b/>
-          <w:sz w:val="21"/>
-        </w:rPr>
-        <w:t>all 11 supported JFrog package types</w:t>
-      </w:r>
-      <w:r>
-        <w:rPr>
-          <w:sz w:val="21"/>
-        </w:rPr>
-        <w:t xml:space="preserve"> end-to-end on </w:t>
+        <w:t>Load Healer Reactive</w:t>
+      </w:r>
+      <w:r>
+        <w:rPr>
+          <w:sz w:val="21"/>
+        </w:rPr>
+        <w:t xml:space="preserve"> — shipped OUTAGE → HTTP 429 throttle (</w:t>
       </w:r>
       <w:r>
         <w:rPr>
           <w:rFonts w:ascii="Consolas" w:hAnsi="Consolas"/>
           <w:sz w:val="21"/>
         </w:rPr>
-        <w:t>geicoeast.jfrog.io</w:t>
-      </w:r>
-      <w:r>
-        <w:rPr>
-          <w:sz w:val="21"/>
-        </w:rPr>
-        <w:t xml:space="preserve">; SaaS load test at </w:t>
-      </w:r>
-      <w:r>
-        <w:rPr>
-          <w:b/>
-          <w:sz w:val="21"/>
-        </w:rPr>
-        <w:t>5,000 repos / 5,000 parallel artifacts</w:t>
-      </w:r>
-      <w:r>
-        <w:rPr>
-          <w:sz w:val="21"/>
-        </w:rPr>
-        <w:t xml:space="preserve"> to characterize the cutover envelope</w:t>
+        <w:t>pkg-jfrog-charts</w:t>
+      </w:r>
+      <w:r>
+        <w:rPr>
+          <w:sz w:val="21"/>
+        </w:rPr>
+        <w:t xml:space="preserve"> PR #109/#111); validated on NP, deployed to </w:t>
+      </w:r>
+      <w:r>
+        <w:rPr>
+          <w:b/>
+          <w:sz w:val="21"/>
+        </w:rPr>
+        <w:t>PD2</w:t>
+      </w:r>
+      <w:r>
+        <w:rPr>
+          <w:sz w:val="21"/>
+        </w:rPr>
+        <w:t>; data-driven per-account concurrency threshold</w:t>
       </w:r>
     </w:p>
     <w:p>
@@ -463,52 +483,26 @@
           <w:b/>
           <w:sz w:val="21"/>
         </w:rPr>
-        <w:t>Architected the Entra ID auth boundary for `amp-control-plane`</w:t>
-      </w:r>
-      <w:r>
-        <w:rPr>
-          <w:sz w:val="21"/>
-        </w:rPr>
-        <w:t xml:space="preserve"> — cross-team plan with </w:t>
-      </w:r>
-      <w:r>
-        <w:rPr>
-          <w:b/>
-          <w:sz w:val="21"/>
-        </w:rPr>
-        <w:t>Go JWT middleware</w:t>
-      </w:r>
-      <w:r>
-        <w:rPr>
-          <w:sz w:val="21"/>
-        </w:rPr>
-        <w:t xml:space="preserve"> at the service edge and </w:t>
-      </w:r>
-      <w:r>
-        <w:rPr>
-          <w:b/>
-          <w:sz w:val="21"/>
-        </w:rPr>
-        <w:t>Azure APIM</w:t>
-      </w:r>
-      <w:r>
-        <w:rPr>
-          <w:sz w:val="21"/>
-        </w:rPr>
-        <w:t xml:space="preserve"> defense-in-depth; deployed </w:t>
-      </w:r>
-      <w:r>
-        <w:rPr>
-          <w:rFonts w:ascii="Consolas" w:hAnsi="Consolas"/>
-          <w:sz w:val="21"/>
-        </w:rPr>
-        <w:t>amp-control-plane</w:t>
-      </w:r>
-      <w:r>
-        <w:rPr>
-          <w:sz w:val="21"/>
-        </w:rPr>
-        <w:t xml:space="preserve"> to Azure Container Service production</w:t>
+        <w:t>Martech-off / JFrog SaaS cutover</w:t>
+      </w:r>
+      <w:r>
+        <w:rPr>
+          <w:sz w:val="21"/>
+        </w:rPr>
+        <w:t xml:space="preserve"> (hard date Jan 30) — stood up migration channels; kicked off MAP, CDP, Billing, Payments, Bolt·Athena; </w:t>
+      </w:r>
+      <w:r>
+        <w:rPr>
+          <w:b/>
+          <w:sz w:val="21"/>
+        </w:rPr>
+        <w:t>`amp-migrate`</w:t>
+      </w:r>
+      <w:r>
+        <w:rPr>
+          <w:sz w:val="21"/>
+        </w:rPr>
+        <w:t xml:space="preserve"> for OIDC + repo-settings campaigns</w:t>
       </w:r>
     </w:p>
     <w:p>
@@ -521,78 +515,33 @@
           <w:b/>
           <w:sz w:val="21"/>
         </w:rPr>
-        <w:t>Self-service developer experience for artifact onboarding</w:t>
-      </w:r>
-      <w:r>
-        <w:rPr>
-          <w:sz w:val="21"/>
-        </w:rPr>
-        <w:t xml:space="preserve"> — designed an </w:t>
-      </w:r>
-      <w:r>
-        <w:rPr>
-          <w:b/>
-          <w:sz w:val="21"/>
-        </w:rPr>
-        <w:t>AI-consumable artifact-auth ADR</w:t>
-      </w:r>
-      <w:r>
-        <w:rPr>
-          <w:sz w:val="21"/>
-        </w:rPr>
-        <w:t xml:space="preserve"> so any team (or AI agent) can onboard external repos without AMP hand-holding; introduced JFrog/Slack/ADO/GitHub </w:t>
-      </w:r>
-      <w:r>
-        <w:rPr>
-          <w:b/>
-          <w:sz w:val="21"/>
-        </w:rPr>
-        <w:t>MCP servers</w:t>
-      </w:r>
-      <w:r>
-        <w:rPr>
-          <w:sz w:val="21"/>
-        </w:rPr>
-        <w:t xml:space="preserve"> and Claude/Cursor agent skills (</w:t>
-      </w:r>
-      <w:r>
-        <w:rPr>
-          <w:rFonts w:ascii="Consolas" w:hAnsi="Consolas"/>
-          <w:sz w:val="21"/>
-        </w:rPr>
-        <w:t>solve-case</w:t>
-      </w:r>
-      <w:r>
-        <w:rPr>
-          <w:sz w:val="21"/>
-        </w:rPr>
-        <w:t xml:space="preserve">, </w:t>
-      </w:r>
-      <w:r>
-        <w:rPr>
-          <w:rFonts w:ascii="Consolas" w:hAnsi="Consolas"/>
-          <w:sz w:val="21"/>
-        </w:rPr>
-        <w:t>close-case</w:t>
-      </w:r>
-      <w:r>
-        <w:rPr>
-          <w:sz w:val="21"/>
-        </w:rPr>
-        <w:t xml:space="preserve">, </w:t>
-      </w:r>
-      <w:r>
-        <w:rPr>
-          <w:rFonts w:ascii="Consolas" w:hAnsi="Consolas"/>
-          <w:sz w:val="21"/>
-        </w:rPr>
-        <w:t>build-kb</w:t>
-      </w:r>
-      <w:r>
-        <w:rPr>
-          <w:sz w:val="21"/>
-        </w:rPr>
-        <w:t>) that automate AMP's support, RCA, and runbook workflows</w:t>
+        <w:t>Technical lead, JFrog SaaS POC</w:t>
+      </w:r>
+      <w:r>
+        <w:rPr>
+          <w:sz w:val="21"/>
+        </w:rPr>
+        <w:t xml:space="preserve"> — GitHub Actions validating </w:t>
+      </w:r>
+      <w:r>
+        <w:rPr>
+          <w:b/>
+          <w:sz w:val="21"/>
+        </w:rPr>
+        <w:t>all 11 package types</w:t>
+      </w:r>
+      <w:r>
+        <w:rPr>
+          <w:sz w:val="21"/>
+        </w:rPr>
+        <w:t xml:space="preserve"> e2e; load test </w:t>
+      </w:r>
+      <w:r>
+        <w:rPr>
+          <w:b/>
+          <w:sz w:val="21"/>
+        </w:rPr>
+        <w:t>5,000 repos / 5,000 parallel artifacts</w:t>
       </w:r>
     </w:p>
     <w:p>
@@ -605,13 +554,13 @@
           <w:b/>
           <w:sz w:val="21"/>
         </w:rPr>
-        <w:t>AI-powered CI/CD migration engine</w:t>
-      </w:r>
-      <w:r>
-        <w:rPr>
-          <w:sz w:val="21"/>
-        </w:rPr>
-        <w:t xml:space="preserve"> for the JFrog SaaS cutover that opens per-team PRs across the inventoried pipeline fleet (target: 100% coverage) — Release Platform itself benefiting from agentic automation</w:t>
+        <w:t>Entra ID auth for `amp-control-plane`</w:t>
+      </w:r>
+      <w:r>
+        <w:rPr>
+          <w:sz w:val="21"/>
+        </w:rPr>
+        <w:t xml:space="preserve"> — Go JWT + Azure APIM; ACS production deploy</w:t>
       </w:r>
     </w:p>
     <w:p>
@@ -624,26 +573,45 @@
           <w:b/>
           <w:sz w:val="21"/>
         </w:rPr>
+        <w:t>Self-service + agentic DX</w:t>
+      </w:r>
+      <w:r>
+        <w:rPr>
+          <w:sz w:val="21"/>
+        </w:rPr>
+        <w:t xml:space="preserve"> — AI-consumable artifact-auth ADR; JFrog/Slack/ADO/GitHub MCP servers + Claude/Cursor agent skills; Slack maintenance-announcement skill</w:t>
+      </w:r>
+    </w:p>
+    <w:p>
+      <w:pPr>
+        <w:pStyle w:val="ResumeBullets"/>
+        <w:spacing w:after="40"/>
+      </w:pPr>
+      <w:r>
+        <w:rPr>
+          <w:b/>
+          <w:sz w:val="21"/>
+        </w:rPr>
         <w:t>Production incident leadership</w:t>
       </w:r>
       <w:r>
         <w:rPr>
           <w:sz w:val="21"/>
         </w:rPr>
-        <w:t xml:space="preserve"> — packet-level </w:t>
-      </w:r>
-      <w:r>
-        <w:rPr>
-          <w:b/>
-          <w:sz w:val="21"/>
-        </w:rPr>
-        <w:t>Azure Firewall TLS DPI</w:t>
-      </w:r>
-      <w:r>
-        <w:rPr>
-          <w:sz w:val="21"/>
-        </w:rPr>
-        <w:t xml:space="preserve"> RCA on S3-backed Artifactory repos; multiple JFrog Go-module cache RCAs; lead on cross-org Identity/Network/SRE bridge calls</w:t>
+        <w:t xml:space="preserve"> — Azure Firewall TLS DPI RCA; Go-module cache RCAs; PD Phase 1 stability; TLS renewals with </w:t>
+      </w:r>
+      <w:r>
+        <w:rPr>
+          <w:b/>
+          <w:sz w:val="21"/>
+        </w:rPr>
+        <w:t>&amp;lt;1 min</w:t>
+      </w:r>
+      <w:r>
+        <w:rPr>
+          <w:sz w:val="21"/>
+        </w:rPr>
+        <w:t xml:space="preserve"> outage</w:t>
       </w:r>
     </w:p>
     <w:p>

</xml_diff>